<commit_message>
docs: clarify canonical teaching sources
</commit_message>
<xml_diff>
--- a/docs/teaching/Cramapple-Learning-and-Curriculum-System-v0.7.docx
+++ b/docs/teaching/Cramapple-Learning-and-Curriculum-System-v0.7.docx
@@ -83,21 +83,7 @@
         <w:spacing w:after="40"/>
       </w:pPr>
       <w:r>
-        <w:rPr>
-          <w:rFonts w:ascii="Calibri" w:hAnsi="Calibri"/>
-          <w:b/>
-          <w:color w:val="202D3A"/>
-          <w:sz w:val="21"/>
-        </w:rPr>
-        <w:t xml:space="preserve">Status: </w:t>
-      </w:r>
-      <w:r>
-        <w:rPr>
-          <w:rFonts w:ascii="Calibri" w:hAnsi="Calibri"/>
-          <w:color w:val="202D3A"/>
-          <w:sz w:val="21"/>
-        </w:rPr>
-        <w:t>Ready for owner review</w:t>
+        <w:t>Status: Generated presentation snapshot; noncanonical. Canonical source: LEARNING_SYSTEM.md.</w:t>
       </w:r>
     </w:p>
     <w:p>

</xml_diff>